<commit_message>
Adiciona novas funcionalidades e prepara para mais imagens6
</commit_message>
<xml_diff>
--- a/materiais/HIDRO_Caderno_de_atividades.docx
+++ b/materiais/HIDRO_Caderno_de_atividades.docx
@@ -22445,6 +22445,16 @@
         </w:tc>
       </w:tr>
     </w:tbl>
+    <w:p>
+      <w:r>
+        <w:rPr>
+          <w:rFonts w:ascii="Calibri" w:hAnsi="Calibri"/>
+          <w:color w:val="4A5A73"/>
+          <w:sz w:val="18"/>
+        </w:rPr>
+        <w:t>Material do projeto HIDRO: Redução de Riscos. Programa de computador registrado no INPI sob o processo nº BR 51 2026 009207-8, titularidade da UFGD.</w:t>
+      </w:r>
+    </w:p>
     <w:sectPr>
       <w:headerReference w:type="default" r:id="rId7"/>
       <w:footerReference w:type="default" r:id="rId8"/>

</xml_diff>